<commit_message>
Padrão de apostilas: notas editoriais verdes restauradas (P2021-12-04: 21 notas; P2021-01-23: 24 notas) + correções STT residuais + DOCX regenerados
</commit_message>
<xml_diff>
--- a/apostilas/CONCLUIDAS/2021-01-23_vyasa_descortinar_novo_paraiso/Apostila - Vyasa e o Descortinar de um Novo Paraíso.docx
+++ b/apostilas/CONCLUIDAS/2021-01-23_vyasa_descortinar_novo_paraiso/Apostila - Vyasa e o Descortinar de um Novo Paraíso.docx
@@ -166,6 +166,41 @@
         <w:br w:type="page"/>
       </w:r>
     </w:p>
+    <w:tbl>
+      <w:tblPr>
+        <w:tblW w:type="auto" w:w="0"/>
+        <w:jc w:val="left"/>
+        <w:tblLook w:firstColumn="1" w:firstRow="1" w:lastColumn="0" w:lastRow="0" w:noHBand="0" w:noVBand="1" w:val="04A0"/>
+      </w:tblPr>
+      <w:tblGrid>
+        <w:gridCol w:w="9745"/>
+      </w:tblGrid>
+      <w:tr>
+        <w:tc>
+          <w:tcPr>
+            <w:tcW w:type="dxa" w:w="9745"/>
+            <w:shd w:val="clear" w:fill="EAF3EA"/>
+            <w:tcBorders>
+              <w:left w:val="single" w:sz="24" w:color="2E7D4F"/>
+            </w:tcBorders>
+          </w:tcPr>
+          <w:p>
+            <w:r>
+              <w:rPr>
+                <w:color w:val="2E7D4F"/>
+                <w:sz w:val="19"/>
+              </w:rPr>
+              <w:t>Nota do editor: tema-título — o paraíso 'furado' e os três reinos da antiguidade (RC-612); 'se isso aqui for paraíso, vamos inventar outro' (U1099).</w:t>
+            </w:r>
+          </w:p>
+        </w:tc>
+      </w:tr>
+    </w:tbl>
+    <w:p>
+      <w:pPr>
+        <w:spacing w:after="40"/>
+      </w:pPr>
+    </w:p>
     <w:p>
       <w:pPr>
         <w:pStyle w:val="Heading1"/>
@@ -201,6 +236,41 @@
         </w:rPr>
         <w:t>Mas assim, essa palestra de hoje ela é chata, no sentido de que eu gostaria de não fazê-la, mas é necessário, do jeito que existem livros horríveis de ser vistos livros terríveis de serem livros, mas são necessários para que a gente conheça certas coisas. Essa palestra de hoje vai por aí.</w:t>
       </w:r>
+    </w:p>
+    <w:tbl>
+      <w:tblPr>
+        <w:tblW w:type="auto" w:w="0"/>
+        <w:jc w:val="left"/>
+        <w:tblLook w:firstColumn="1" w:firstRow="1" w:lastColumn="0" w:lastRow="0" w:noHBand="0" w:noVBand="1" w:val="04A0"/>
+      </w:tblPr>
+      <w:tblGrid>
+        <w:gridCol w:w="9745"/>
+      </w:tblGrid>
+      <w:tr>
+        <w:tc>
+          <w:tcPr>
+            <w:tcW w:type="dxa" w:w="9745"/>
+            <w:shd w:val="clear" w:fill="EAF3EA"/>
+            <w:tcBorders>
+              <w:left w:val="single" w:sz="24" w:color="2E7D4F"/>
+            </w:tcBorders>
+          </w:tcPr>
+          <w:p>
+            <w:r>
+              <w:rPr>
+                <w:color w:val="2E7D4F"/>
+                <w:sz w:val="19"/>
+              </w:rPr>
+              <w:t>Nota do editor: abertura — o autor classifica a palestra como 'chata, mas necessária' e pede prudência; tema ligado a Vyasa (RC-585) e ao Novo Paraíso (RC-612).</w:t>
+            </w:r>
+          </w:p>
+        </w:tc>
+      </w:tr>
+    </w:tbl>
+    <w:p>
+      <w:pPr>
+        <w:spacing w:after="40"/>
+      </w:pPr>
     </w:p>
     <w:p>
       <w:pPr>
@@ -313,6 +383,41 @@
         <w:t>Então, pra gente iniciar, antes ainda de iniciar, talvez seja conveniente eu explicar uma coisa a vocês. Aqui tem pessoas que entendem de eletricidade, tá? Vou pedir desculpas porque eu vou inventar aqui uma uma coisa aqui. Vamos imaginar um poste, outro poste, outro poste e um fio daqui para cá, daqui para cá. E assim a energia gerada em algum ponto é transmitida para cá. Esses fios estão muito bem construídos, né? Então, a corrente passa por aqui, por aqui e a coisa vai. Ou seja, a informação, a corrente, o tipo de carga que se pretende passar por esse fio, esse sistema funciona legal. Agora, imaginemos um poste cujo fio tem problemas e é cortado e ele fica com Todos os fios soltos que deveriam estar ajustados, entrelaçados e dentro do fil. Aqui a informação flui muito bem. Aqui não é o trân.</w:t>
       </w:r>
     </w:p>
+    <w:tbl>
+      <w:tblPr>
+        <w:tblW w:type="auto" w:w="0"/>
+        <w:jc w:val="left"/>
+        <w:tblLook w:firstColumn="1" w:firstRow="1" w:lastColumn="0" w:lastRow="0" w:noHBand="0" w:noVBand="1" w:val="04A0"/>
+      </w:tblPr>
+      <w:tblGrid>
+        <w:gridCol w:w="9745"/>
+      </w:tblGrid>
+      <w:tr>
+        <w:tc>
+          <w:tcPr>
+            <w:tcW w:type="dxa" w:w="9745"/>
+            <w:shd w:val="clear" w:fill="EAF3EA"/>
+            <w:tcBorders>
+              <w:left w:val="single" w:sz="24" w:color="2E7D4F"/>
+            </w:tcBorders>
+          </w:tcPr>
+          <w:p>
+            <w:r>
+              <w:rPr>
+                <w:color w:val="2E7D4F"/>
+                <w:sz w:val="19"/>
+              </w:rPr>
+              <w:t>Nota do editor: a metáfora dos 'fios soltos' (poste e fios elétricos) — fonte original do conceito (RC-604; RC-104): 'quando o criador caiu, ele ficou com bilhões de fios soltos'.</w:t>
+            </w:r>
+          </w:p>
+        </w:tc>
+      </w:tr>
+    </w:tbl>
+    <w:p>
+      <w:pPr>
+        <w:spacing w:after="40"/>
+      </w:pPr>
+    </w:p>
     <w:p>
       <w:pPr>
         <w:pStyle w:val="Heading2"/>
@@ -449,6 +554,41 @@
         <w:t>Então pessoal, qual é o drama? Quando Moros percebeu o tamanho dessa confusão aqui? Ele viu que não ia resolver, ele sumiu, mas ele gerou três seres que não são mulheres, como as mitologias falam, as moiras sob a perspectiva da mitologia eh grega ou as nornes da mitologia nórdica.</w:t>
       </w:r>
     </w:p>
+    <w:tbl>
+      <w:tblPr>
+        <w:tblW w:type="auto" w:w="0"/>
+        <w:jc w:val="left"/>
+        <w:tblLook w:firstColumn="1" w:firstRow="1" w:lastColumn="0" w:lastRow="0" w:noHBand="0" w:noVBand="1" w:val="04A0"/>
+      </w:tblPr>
+      <w:tblGrid>
+        <w:gridCol w:w="9745"/>
+      </w:tblGrid>
+      <w:tr>
+        <w:tc>
+          <w:tcPr>
+            <w:tcW w:type="dxa" w:w="9745"/>
+            <w:shd w:val="clear" w:fill="EAF3EA"/>
+            <w:tcBorders>
+              <w:left w:val="single" w:sz="24" w:color="2E7D4F"/>
+            </w:tcBorders>
+          </w:tcPr>
+          <w:p>
+            <w:r>
+              <w:rPr>
+                <w:color w:val="2E7D4F"/>
+                <w:sz w:val="19"/>
+              </w:rPr>
+              <w:t>Nota do editor: as Moiras/Nornes (RC-467) como 'três seres que não são mulheres, como as mitologias falam' — herdeiros dos fios soltos; funcionam como 'computador/GPS' das assinaturas quânticas (U0075–U0120).</w:t>
+            </w:r>
+          </w:p>
+        </w:tc>
+      </w:tr>
+    </w:tbl>
+    <w:p>
+      <w:pPr>
+        <w:spacing w:after="40"/>
+      </w:pPr>
+    </w:p>
     <w:p>
       <w:pPr>
         <w:pStyle w:val="Heading2"/>
@@ -549,6 +689,41 @@
         <w:t>Mas continuou, continuou, continuou da forma dele. E a gente vai abordar um pouco disso hoje à tarde, mas compreendo. E desculpem falar desse jeito, mas não há outra alternativa. A única linha que vincula o ano 2021 na Terra com o que o que aconteceu nos primórdios do I do universo é o I. O IEA tá recebendo hoje um fluxo que nunca deixou de existir, apenas se interrompia para esperar tempos melhores para poder se fazer presente. Aonde? Quando as três flechas de Moros consorciassem para uma única espécie. Em outras palavras, quando o espírito de Moros tivesse três encarnações ou mesma espécie, e realizasse o trabalho de religar alguns desses pontos. Dentro isso, eu vou ter que novamente dizer o seguinte: nós aqui do estamos lidando com assuntos absolutamente superlativos, difíceis de ser codificados, entendidos pela lógica humana, mais de todas as lógicas que existem, inclusive de Deus [REVISAR — STT 'combo'].</w:t>
       </w:r>
     </w:p>
+    <w:tbl>
+      <w:tblPr>
+        <w:tblW w:type="auto" w:w="0"/>
+        <w:jc w:val="left"/>
+        <w:tblLook w:firstColumn="1" w:firstRow="1" w:lastColumn="0" w:lastRow="0" w:noHBand="0" w:noVBand="1" w:val="04A0"/>
+      </w:tblPr>
+      <w:tblGrid>
+        <w:gridCol w:w="9745"/>
+      </w:tblGrid>
+      <w:tr>
+        <w:tc>
+          <w:tcPr>
+            <w:tcW w:type="dxa" w:w="9745"/>
+            <w:shd w:val="clear" w:fill="EAF3EA"/>
+            <w:tcBorders>
+              <w:left w:val="single" w:sz="24" w:color="2E7D4F"/>
+            </w:tcBorders>
+          </w:tcPr>
+          <w:p>
+            <w:r>
+              <w:rPr>
+                <w:color w:val="2E7D4F"/>
+                <w:sz w:val="19"/>
+              </w:rPr>
+              <w:t>Nota do editor: as três setas/flechas de Moros (RC-454): quando reencontradas, 'a história universal retroagiria ao momento zero e seria finalmente contada' (U0107–U0108; U1359–U1372).</w:t>
+            </w:r>
+          </w:p>
+        </w:tc>
+      </w:tr>
+    </w:tbl>
+    <w:p>
+      <w:pPr>
+        <w:spacing w:after="40"/>
+      </w:pPr>
+    </w:p>
     <w:p>
       <w:pPr>
         <w:pStyle w:val="Heading2"/>
@@ -810,6 +985,41 @@
         <w:t>Aí Brahma dizia: "Não, você está errado, eu tô certo, eu tô errado." Aí Vishnu disse para ele, eu aposto meu poder contra esses seres, como eu já disse em outras palestras, eu tô tendo que repetir aqui, eles têm um código de honra que quando um desafia o outro, o outro tem que aceitar a E quando o Virismo diz meu poder pelo seu Brahma não pode José não pôde recusar. Tá bom, tá feita a aposta. Se Enoque fizer o que eu estou dizendo que ele vai fazer, eu ganho. Se Enoque não fizer o que eu estou dizendo que ele vai fazer, você ganha. Vamos registrar essa aposta. Hoje em dia a gente registra registra aposta em cartórios. Os demos o fazem assim. Se a aposta deles é em relação a uma montanha, eles marcam a montanha com DNA deles. É igual aquela marca de gato que a gente conhece a vaca que é minha. Eles então marcaram no DNA de Enoque os termos da aposta e cada um colocou a sua assinatura quântica, ou seja, a forma do seu poder pessoal. Porque se Enoque fizesse o que Javel disse que ele iria fazer, naturalmente no DNA de de Enoque iria se acender a assinatura de Javé. Então a ponte cônica entre os dois estava estabelecida e a assinatura de Bismo estaria subordinada de Javé, ou seja, a forma do poder ver qual do Vishnu seria absorvida por Javé ou vice? Qual a confusão? Enoque não fazia nem o que V queria, nem o que B queria, J queria pela lógica ou pela lila que define os termos da convivência da tributo. Lila é a conversão, a constituição da tributo, o termo sâns quando dois dos tr três discutiam, o terceiro seria necessariamente o juiz da contela. Então, como virgen, Javel e Brahma estavam numa pendega, China ia ser o juiz. Vishnu e Shiva nunca brigaram. Javé e Shiva brigaram tempo que mais Javé tinha que aceitar. Então, chamaram Shiva. Shiva escutou o problema, aí no final disse: "Tem um probleminha aqui, vocês dois estão certos." Mas não é pelo que visto, da Certo problema porque Xavé, você tinha que ter registrado a força, a sua forma de poder em Enoque, lá naquela região do seu Dromolo e Vishnu, você teria que ter registrado a sua assinatura no DNA de Enoque, levando Enoque lá paraa que é sua loca. Você fez isso que o Brahma loca, então não registrou direito. Mas eu desafio vocês dois e digo que Enoque não vai fazer nem o que você já disse que ele iria, nem o que você Vishnu disse que ele iria. Eu digo que Enque tem fazer isso, isso e aposta a minha forma de poder na pessoa. Aí os dois tiveram que aceitar. Aí Enoque foi levado pra loca de Shiva. Ele ferrou DNA de Enque. Enoque foi levado para loca de vigilo. V ferrou de novo com Brahma. Brahma ferrou. O velo de Enoque morreu.</w:t>
       </w:r>
     </w:p>
+    <w:tbl>
+      <w:tblPr>
+        <w:tblW w:type="auto" w:w="0"/>
+        <w:jc w:val="left"/>
+        <w:tblLook w:firstColumn="1" w:firstRow="1" w:lastColumn="0" w:lastRow="0" w:noHBand="0" w:noVBand="1" w:val="04A0"/>
+      </w:tblPr>
+      <w:tblGrid>
+        <w:gridCol w:w="9745"/>
+      </w:tblGrid>
+      <w:tr>
+        <w:tc>
+          <w:tcPr>
+            <w:tcW w:type="dxa" w:w="9745"/>
+            <w:shd w:val="clear" w:fill="EAF3EA"/>
+            <w:tcBorders>
+              <w:left w:val="single" w:sz="24" w:color="2E7D4F"/>
+            </w:tcBorders>
+          </w:tcPr>
+          <w:p>
+            <w:r>
+              <w:rPr>
+                <w:color w:val="2E7D4F"/>
+                <w:sz w:val="19"/>
+              </w:rPr>
+              <w:t>Nota do editor: a aposta Javé×Vishnu (RC-001; RC-135 — ficha retida) envolvendo Enoque; 'eles têm um código de honra que quando um desafia o outro, o outro tem que aceitar' (U0369).</w:t>
+            </w:r>
+          </w:p>
+        </w:tc>
+      </w:tr>
+    </w:tbl>
+    <w:p>
+      <w:pPr>
+        <w:spacing w:after="40"/>
+      </w:pPr>
+    </w:p>
     <w:p>
       <w:pPr>
         <w:pStyle w:val="Heading2"/>
@@ -910,6 +1120,41 @@
         <w:t>Noé e sua descendência. É, e aqui vocês têm que prestar bem atenção, porque aí começa a chegar no que importa para Noé, o se três filhos. Cro, tudo que a gente imaginar de Oriente Médio é descendente do DNA de C. Tudo que a gente imaginar de africano, tudo que a gente imaginar de europeu e asiático foi descendente do DNA de Jafé. Então isso aqui, eu tô falando de religião, não com o estudo do genoma humano, com o avanço dos estudos de genética, foi feito uma pesquisa mundial e a turma que não acreditava em Noé teve que aceitar o fato de que a humanidade é dividida em quatro grandes segmentos genéticos. Dos quatro, três São esses aqui, um Oriente do Oriente Médico, na África e o E isso aqui surgiu a partir de uma região próxima a Turquia, que é onde essa essa arca, essa ciência. E a quarta região da Terra é as Américas, que aí não é o DNA de nenhum dos três filhos da fé, mas como é nenhum dos três filhos de Noé, como Noé Olhem bem, é o último antes do dilúvio daquela genealogia que começa Adão, sete enos Cainâel, Jared, Enoque, Matusalém, Ladec, Noé.</w:t>
       </w:r>
     </w:p>
+    <w:tbl>
+      <w:tblPr>
+        <w:tblW w:type="auto" w:w="0"/>
+        <w:jc w:val="left"/>
+        <w:tblLook w:firstColumn="1" w:firstRow="1" w:lastColumn="0" w:lastRow="0" w:noHBand="0" w:noVBand="1" w:val="04A0"/>
+      </w:tblPr>
+      <w:tblGrid>
+        <w:gridCol w:w="9745"/>
+      </w:tblGrid>
+      <w:tr>
+        <w:tc>
+          <w:tcPr>
+            <w:tcW w:type="dxa" w:w="9745"/>
+            <w:shd w:val="clear" w:fill="EAF3EA"/>
+            <w:tcBorders>
+              <w:left w:val="single" w:sz="24" w:color="2E7D4F"/>
+            </w:tcBorders>
+          </w:tcPr>
+          <w:p>
+            <w:r>
+              <w:rPr>
+                <w:color w:val="2E7D4F"/>
+                <w:sz w:val="19"/>
+              </w:rPr>
+              <w:t>Nota do editor: os quatro segmentos genéticos (RC-024) — QUARENTENA CIENTÍFICA: leitura do autor ('estudo do genoma humano, não religião'), jamais dado validado (U0435–U0442).</w:t>
+            </w:r>
+          </w:p>
+        </w:tc>
+      </w:tr>
+    </w:tbl>
+    <w:p>
+      <w:pPr>
+        <w:spacing w:after="40"/>
+      </w:pPr>
+    </w:p>
     <w:p>
       <w:pPr>
         <w:pStyle w:val="Heading2"/>
@@ -1046,6 +1291,41 @@
         <w:t>Quando ele viu que a linhagem que ele começou com Adão ia ser interrompida por causa da dessa figura, o que é que ele fez? Ele foi, a linhagem de Cam [REVISAR — STT 'C'], ele não podia usar porque foi maldita por Noé, porque Cam viu Noé [REVISAR — STT 'Cã'] no depois de uma pelvis maluca que ele tomou lá santa noite. Aí ele escolheu da linhagem dos filhos de Jafé, um deles chamado Gomer, que é o ancestral da genética do povo ariano. E os filhos de Gomer Como Javé foi rechaçado pela descendência oficial de Sem [REVISAR — STT 'Seno'], ele pegou uma descendência de Gomer e se apresentou a essa figura aqui, ao povo ariano, e o nome Brahma surge aqui. Até então esse ser era conhecido como Javé, vamos assim dizer, por essa linhagem. Isso aqui é linhagem semítica, babilônica judi. Aqui é alian Aqui ele ficou conhecido como Brahma. Qual o detalhe? O detalhe é que quando Éber, Javé, Éber e Faleg [REVISAR — STT] morre, os três vão para essa descendência aqui. Qual é o detalhe?</w:t>
       </w:r>
     </w:p>
+    <w:tbl>
+      <w:tblPr>
+        <w:tblW w:type="auto" w:w="0"/>
+        <w:jc w:val="left"/>
+        <w:tblLook w:firstColumn="1" w:firstRow="1" w:lastColumn="0" w:lastRow="0" w:noHBand="0" w:noVBand="1" w:val="04A0"/>
+      </w:tblPr>
+      <w:tblGrid>
+        <w:gridCol w:w="9745"/>
+      </w:tblGrid>
+      <w:tr>
+        <w:tc>
+          <w:tcPr>
+            <w:tcW w:type="dxa" w:w="9745"/>
+            <w:shd w:val="clear" w:fill="EAF3EA"/>
+            <w:tcBorders>
+              <w:left w:val="single" w:sz="24" w:color="2E7D4F"/>
+            </w:tcBorders>
+          </w:tcPr>
+          <w:p>
+            <w:r>
+              <w:rPr>
+                <w:color w:val="2E7D4F"/>
+                <w:sz w:val="19"/>
+              </w:rPr>
+              <w:t>Nota do editor: Javé apresentando-se aos arianos como Brahma (RC-001/RC-037) após a recusa de Faleg (= espírito de Rochester) — 'Faleg = Rochester' na Colecionar Incertezas (U0461–U0475).</w:t>
+            </w:r>
+          </w:p>
+        </w:tc>
+      </w:tr>
+    </w:tbl>
+    <w:p>
+      <w:pPr>
+        <w:spacing w:after="40"/>
+      </w:pPr>
+    </w:p>
     <w:p>
       <w:pPr>
         <w:pStyle w:val="Heading2"/>
@@ -1243,6 +1523,41 @@
         <w:t>Então assim, Vyasa foi neto de um ser chamado Apantaratamas. Você sabe o que é Apantaratamas? É Enoque. Apenas o nome de Enoque conhecido na tradição védica é Apantaratamas. Mas como quando Enoque morreu e ficou a múmia, ficou o anjo, o corpo lá [REVISAR — STT], o DNA dele foi preparado.</w:t>
       </w:r>
     </w:p>
+    <w:tbl>
+      <w:tblPr>
+        <w:tblW w:type="auto" w:w="0"/>
+        <w:jc w:val="left"/>
+        <w:tblLook w:firstColumn="1" w:firstRow="1" w:lastColumn="0" w:lastRow="0" w:noHBand="0" w:noVBand="1" w:val="04A0"/>
+      </w:tblPr>
+      <w:tblGrid>
+        <w:gridCol w:w="9745"/>
+      </w:tblGrid>
+      <w:tr>
+        <w:tc>
+          <w:tcPr>
+            <w:tcW w:type="dxa" w:w="9745"/>
+            <w:shd w:val="clear" w:fill="EAF3EA"/>
+            <w:tcBorders>
+              <w:left w:val="single" w:sz="24" w:color="2E7D4F"/>
+            </w:tcBorders>
+          </w:tcPr>
+          <w:p>
+            <w:r>
+              <w:rPr>
+                <w:color w:val="2E7D4F"/>
+                <w:sz w:val="19"/>
+              </w:rPr>
+              <w:t>Nota do editor: Enoque = Apantaratamas (RC-489), nome da tradição védica; 'Tamas é energia de Shiva' — ver também Metatron (RC-671) e o corpo especial (U0525–U0540).</w:t>
+            </w:r>
+          </w:p>
+        </w:tc>
+      </w:tr>
+    </w:tbl>
+    <w:p>
+      <w:pPr>
+        <w:spacing w:after="40"/>
+      </w:pPr>
+    </w:p>
     <w:p>
       <w:pPr>
         <w:pStyle w:val="Heading2"/>
@@ -1268,6 +1583,41 @@
         <w:t>Cerca de uns 9.000 anos depois, essa turma pegou o DNA de Enoque e saiu fertilizando... umas demos [REVISAR — STT] que viviam entre a loca delas, deles e a terra, os portais eram abertos e também fecundaram alguns minérios da é uma confusão total. É uma época difícil da gente falar porque escandaliza.</w:t>
       </w:r>
     </w:p>
+    <w:tbl>
+      <w:tblPr>
+        <w:tblW w:type="auto" w:w="0"/>
+        <w:jc w:val="left"/>
+        <w:tblLook w:firstColumn="1" w:firstRow="1" w:lastColumn="0" w:lastRow="0" w:noHBand="0" w:noVBand="1" w:val="04A0"/>
+      </w:tblPr>
+      <w:tblGrid>
+        <w:gridCol w:w="9745"/>
+      </w:tblGrid>
+      <w:tr>
+        <w:tc>
+          <w:tcPr>
+            <w:tcW w:type="dxa" w:w="9745"/>
+            <w:shd w:val="clear" w:fill="EAF3EA"/>
+            <w:tcBorders>
+              <w:left w:val="single" w:sz="24" w:color="2E7D4F"/>
+            </w:tcBorders>
+          </w:tcPr>
+          <w:p>
+            <w:r>
+              <w:rPr>
+                <w:color w:val="2E7D4F"/>
+                <w:sz w:val="19"/>
+              </w:rPr>
+              <w:t>Nota do editor: [REVISAR — QUARENTENA]: 'o DNA de Enoque fertilizando demos e minérios' é passagem severa do STT e leitura do autor; registrada na Colecionar Incertezas (U0530–U0531).</w:t>
+            </w:r>
+          </w:p>
+        </w:tc>
+      </w:tr>
+    </w:tbl>
+    <w:p>
+      <w:pPr>
+        <w:spacing w:after="40"/>
+      </w:pPr>
+    </w:p>
     <w:p>
       <w:pPr>
         <w:pStyle w:val="Heading2"/>
@@ -1292,6 +1642,41 @@
         </w:rPr>
         <w:t>Então, Nasceu esse ser chamado Parashara, filho de Apantaratamas, apantaramas. E Enoque foi chamado de apantaras. Tamas é energia de Shiva, porque a descendência de Enoque foi altamente recicladora na lógica do bramanismo. Não é a lógica do judaísmo. Só que esse Parashara, ele foi um gênio, ou seja, o pai de Vyasa, o filho de Enoque. Mas filho não, porque Enoque teve relações e produziu Matusalém. Matusalém foi um tipo de filho biológico, vamos dizer, esse parachar foi o filho filho gerado numa demo que produziu um ser híbrido parachara altamente intelectualizado. E não há ninguém na face da terra que tenha produzido tanto quanto esse nosso amigo Parashara.</w:t>
       </w:r>
+    </w:p>
+    <w:tbl>
+      <w:tblPr>
+        <w:tblW w:type="auto" w:w="0"/>
+        <w:jc w:val="left"/>
+        <w:tblLook w:firstColumn="1" w:firstRow="1" w:lastColumn="0" w:lastRow="0" w:noHBand="0" w:noVBand="1" w:val="04A0"/>
+      </w:tblPr>
+      <w:tblGrid>
+        <w:gridCol w:w="9745"/>
+      </w:tblGrid>
+      <w:tr>
+        <w:tc>
+          <w:tcPr>
+            <w:tcW w:type="dxa" w:w="9745"/>
+            <w:shd w:val="clear" w:fill="EAF3EA"/>
+            <w:tcBorders>
+              <w:left w:val="single" w:sz="24" w:color="2E7D4F"/>
+            </w:tcBorders>
+          </w:tcPr>
+          <w:p>
+            <w:r>
+              <w:rPr>
+                <w:color w:val="2E7D4F"/>
+                <w:sz w:val="19"/>
+              </w:rPr>
+              <w:t>Nota do editor: Parashara (RC-585) — pai de Vyasa, neto de Enoque; criador dos critérios da astrologia védica (Jyotisha) para comprovar avatares (U0538–U0545).</w:t>
+            </w:r>
+          </w:p>
+        </w:tc>
+      </w:tr>
+    </w:tbl>
+    <w:p>
+      <w:pPr>
+        <w:spacing w:after="40"/>
+      </w:pPr>
     </w:p>
     <w:p>
       <w:pPr>
@@ -1418,6 +1803,41 @@
         <w:t>Então a gente vai dar uma parada aí para tomar um café. Na volta a gente vai vai pro lado bom da palestra [REVISAR — STT 'del'], que é o que de fato interessa. Isso aqui eu só por enquanto criei um um um reto para vocês entenderem em termos de tempo e de lugar.</w:t>
       </w:r>
     </w:p>
+    <w:tbl>
+      <w:tblPr>
+        <w:tblW w:type="auto" w:w="0"/>
+        <w:jc w:val="left"/>
+        <w:tblLook w:firstColumn="1" w:firstRow="1" w:lastColumn="0" w:lastRow="0" w:noHBand="0" w:noVBand="1" w:val="04A0"/>
+      </w:tblPr>
+      <w:tblGrid>
+        <w:gridCol w:w="9745"/>
+      </w:tblGrid>
+      <w:tr>
+        <w:tc>
+          <w:tcPr>
+            <w:tcW w:type="dxa" w:w="9745"/>
+            <w:shd w:val="clear" w:fill="EAF3EA"/>
+            <w:tcBorders>
+              <w:left w:val="single" w:sz="24" w:color="2E7D4F"/>
+            </w:tcBorders>
+          </w:tcPr>
+          <w:p>
+            <w:r>
+              <w:rPr>
+                <w:color w:val="2E7D4F"/>
+                <w:sz w:val="19"/>
+              </w:rPr>
+              <w:t>Nota do editor: INTERVALO — o autor interrompe para o café (U0571) e anuncia '15 minutinhos' (U0575).</w:t>
+            </w:r>
+          </w:p>
+        </w:tc>
+      </w:tr>
+    </w:tbl>
+    <w:p>
+      <w:pPr>
+        <w:spacing w:after="40"/>
+      </w:pPr>
+    </w:p>
     <w:p>
       <w:pPr>
         <w:pStyle w:val="Heading2"/>
@@ -1604,6 +2024,41 @@
         <w:t>Na época de viagem, Vyasa teve a ideia de criar um grupo de aproximadamente 20 pessoas. Essa não é a história real. O grupo primeiro que viaja criou tinha mais de 100 pessoas, não é? 100 pessoas, 100 seres. Tinha de tudo muita coisa só. Mas vamos paraa última versão, que é assim que a turma conta. 20 pessoas composto por seres hiperbórios racionalizados. por seres superdemos considerados avatares da época, por seres humanos. Com o tempo, ele desistiu desses avatares aqui, porque estes eles eles eram mais autoritários do que propriamente sábios, apesar de conhecedores das questões da vida em nível confiável de honra e diência. Eu tô falando aqui de Krishna. No final da palestra eu vou ter que contar as confusões entre viasa e a Krishna. das suas expressões avataris. Então, Vyasa, ele reuniu essa esse grupo para tentar criar uma interpretação dos eventos, do que estava acontecendo aqui na Terra, porque era todo mundo de loca vindo para cá, todo mundo de outros planetas, tudo acontecendo aqui, ninguém entendia. Então, com o tempo, ele foi descartando os iperórios influenciáveis, porque essa turma queria influenciar essa para que essa achasse que esse ou aquele avatar era o bichão. Então, viaja foi descartando tudo isso e ficou basicamente ele mesmo na posição de um rich com seres mestiços e alguns humanos.</w:t>
       </w:r>
     </w:p>
+    <w:tbl>
+      <w:tblPr>
+        <w:tblW w:type="auto" w:w="0"/>
+        <w:jc w:val="left"/>
+        <w:tblLook w:firstColumn="1" w:firstRow="1" w:lastColumn="0" w:lastRow="0" w:noHBand="0" w:noVBand="1" w:val="04A0"/>
+      </w:tblPr>
+      <w:tblGrid>
+        <w:gridCol w:w="9745"/>
+      </w:tblGrid>
+      <w:tr>
+        <w:tc>
+          <w:tcPr>
+            <w:tcW w:type="dxa" w:w="9745"/>
+            <w:shd w:val="clear" w:fill="EAF3EA"/>
+            <w:tcBorders>
+              <w:left w:val="single" w:sz="24" w:color="2E7D4F"/>
+            </w:tcBorders>
+          </w:tcPr>
+          <w:p>
+            <w:r>
+              <w:rPr>
+                <w:color w:val="2E7D4F"/>
+                <w:sz w:val="19"/>
+              </w:rPr>
+              <w:t>Nota do editor: o grupo de 20 (de 250 a 21) e a Escola de Decifração (RC-585/RC-094): 'nós nascemos nessa vida para dar continuidade ao que Vyasa fez' (U0704–U0719; U0797–U0820).</w:t>
+            </w:r>
+          </w:p>
+        </w:tc>
+      </w:tr>
+    </w:tbl>
+    <w:p>
+      <w:pPr>
+        <w:spacing w:after="40"/>
+      </w:pPr>
+    </w:p>
     <w:p>
       <w:pPr>
         <w:pStyle w:val="Heading2"/>
@@ -1690,6 +2145,41 @@
         <w:t>Esse tipo de coisa houve na Irlanda e houve na Escócia. E desse tipo de contato surgiu o que Eu chamo de colégio druídico, não é druída, é porque os gaélicos, que são esses irlandeses ou escocêses de primeira hora, esse pessoal eles criaram o método Druid em Celta. Druid quer dizer busca pela verdade. Busca da verdade. Então eles criaram um instituto para estudar. O quê? A verdade. Buscar a verdade. Mas mesmo o ser humano, sendo sagaz, não era todo e qualquer ser humano que podia buscar a verdade. Ele tinha que se submeter ao método druid. Ele tinha que estudar primeiro esse método para poder se tornar um buscador da verdade.</w:t>
       </w:r>
     </w:p>
+    <w:tbl>
+      <w:tblPr>
+        <w:tblW w:type="auto" w:w="0"/>
+        <w:jc w:val="left"/>
+        <w:tblLook w:firstColumn="1" w:firstRow="1" w:lastColumn="0" w:lastRow="0" w:noHBand="0" w:noVBand="1" w:val="04A0"/>
+      </w:tblPr>
+      <w:tblGrid>
+        <w:gridCol w:w="9745"/>
+      </w:tblGrid>
+      <w:tr>
+        <w:tc>
+          <w:tcPr>
+            <w:tcW w:type="dxa" w:w="9745"/>
+            <w:shd w:val="clear" w:fill="EAF3EA"/>
+            <w:tcBorders>
+              <w:left w:val="single" w:sz="24" w:color="2E7D4F"/>
+            </w:tcBorders>
+          </w:tcPr>
+          <w:p>
+            <w:r>
+              <w:rPr>
+                <w:color w:val="2E7D4F"/>
+                <w:sz w:val="19"/>
+              </w:rPr>
+              <w:t>Nota do editor: o método druida (RC-759): 'Druid quer dizer busca pela verdade'; os colégios druídicos, Tuatha de Danann e milesianos (U0732–U0760).</w:t>
+            </w:r>
+          </w:p>
+        </w:tc>
+      </w:tr>
+    </w:tbl>
+    <w:p>
+      <w:pPr>
+        <w:spacing w:after="40"/>
+      </w:pPr>
+    </w:p>
     <w:p>
       <w:pPr>
         <w:pStyle w:val="Heading2"/>
@@ -1714,6 +2204,41 @@
         </w:rPr>
         <w:t>Então, os dois colégios druídicos que aconteceram na terra entre 9 e 8.000 anos sucumbiram, mas a ideia foi iniciada. Vyasa tava retomando essa ideia, porque o próprio espírito dele na época chamada Allan Kardec lá em cima tinha sido druído. Foi nessa época Kardec foi Kardec, tá? Entendam, professor Rivail na França século XIX assumiu o codinome de Allan Kardec [REVISAR — STT 'dono'] um espírito chegou para ele e disse: "Ei, você que tem que codificar". Disse: "Mas eu sou um professor conhecido aqui em Paris. Não, não bota esse nome aí de Allan Kardec. Seu espírito já foi druida lá atrás [REVISAR — STT 'proído']. Nós esse espírito era Zéfiro. Zéfiro é espírito de Rochester. Nós já trabalhamos juntos lá atrás. Então esse lá atrás é nessa época.</w:t>
       </w:r>
+    </w:p>
+    <w:tbl>
+      <w:tblPr>
+        <w:tblW w:type="auto" w:w="0"/>
+        <w:jc w:val="left"/>
+        <w:tblLook w:firstColumn="1" w:firstRow="1" w:lastColumn="0" w:lastRow="0" w:noHBand="0" w:noVBand="1" w:val="04A0"/>
+      </w:tblPr>
+      <w:tblGrid>
+        <w:gridCol w:w="9745"/>
+      </w:tblGrid>
+      <w:tr>
+        <w:tc>
+          <w:tcPr>
+            <w:tcW w:type="dxa" w:w="9745"/>
+            <w:shd w:val="clear" w:fill="EAF3EA"/>
+            <w:tcBorders>
+              <w:left w:val="single" w:sz="24" w:color="2E7D4F"/>
+            </w:tcBorders>
+          </w:tcPr>
+          <w:p>
+            <w:r>
+              <w:rPr>
+                <w:color w:val="2E7D4F"/>
+                <w:sz w:val="19"/>
+              </w:rPr>
+              <w:t>Nota do editor: Kardec (RC-190 — ampliação retida, sem ficha física): o espírito que codificou foi Zéfiro (Rochester), 'já foi druida lá atrás' (U0762–U0769).</w:t>
+            </w:r>
+          </w:p>
+        </w:tc>
+      </w:tr>
+    </w:tbl>
+    <w:p>
+      <w:pPr>
+        <w:spacing w:after="40"/>
+      </w:pPr>
     </w:p>
     <w:p>
       <w:pPr>
@@ -1998,8 +2523,43 @@
           <w:color w:val="6A3D8C"/>
           <w:sz w:val="21"/>
         </w:rPr>
-        <w:t>Isso aqui é o seguinte, até esse tempo as pessoas falavam como poesia. Nesse tempo surgiu a prosa que foi viada basicamente com parachar inventado para poder descrever história sem ser usando a métrica da poesia. Então esse Azrama aqui que se fala é mostrando que a prosa traz descrição que no não se preocupa com rima, com métrico. Então são frases desiguais, mas que tem o sentido, porque até então tudo tinha que ser igual, igual em termos de preocupação de rima para poder garantir que a história tava sendo passada corretamente. Aí Salte disse, Salte era um personagem do do do do do do do do do Braba, tendo falado dessa maneira para via retirou-se e voltou para os seus aposentos no Bramal aí tem um probleminha. Brahma nunca saiu, nunca levantar. Que história é essa? Quem é essa figura que sabendo que Vyasa pela primeira vez tinha composto em prosa e não em verso, ainda que terminou fazendo verso e uma certa forma quando foi escrever para os humanos, mas via estava em dúvida se aquilo era estava a gosto dos seres do chamado conglomerado de realidades, ou seja, os três gregos Brahma de estilo. Esse ser nessa época em Krishna não tava vivo e Krishna se apresentou Nessa época, os seres que viviam aqui na terra, seja humano, seja os de fora, como sendo avatar cacha, ou seja, que trazia uma porção da genética de cada um dos três seres atributos. E eles, Krishna, se apresentou como sendo superior aos três.</w:t>
+        <w:t>Isso aqui é o seguinte, até esse tempo as pessoas falavam como poesia. Nesse tempo surgiu a prosa, que foi Vyasa, basicamente com Parashara, inventada para poder descrever história sem ser usando a métrica da poesia. Então esse Azrama aqui que se fala é mostrando que a prosa traz descrição que no não se preocupa com rima, com métrico. Então são frases desiguais, mas que tem o sentido, porque até então tudo tinha que ser igual, igual em termos de preocupação de rima para poder garantir que a história tava sendo passada corretamente. Aí Salte disse, Salte era um personagem do do do do do do do do do Braba, tendo falado dessa maneira para via retirou-se e voltou para os seus aposentos no Bramal aí tem um probleminha. Brahma nunca saiu, nunca levantar. Que história é essa? Quem é essa figura que sabendo que Vyasa pela primeira vez tinha composto em prosa e não em verso, ainda que terminou fazendo verso e uma certa forma quando foi escrever para os humanos, mas via estava em dúvida se aquilo era estava a gosto dos seres do chamado conglomerado de realidades, ou seja, os três gregos Brahma de estilo. Esse ser nessa época em Krishna não tava vivo e Krishna se apresentou Nessa época, os seres que viviam aqui na terra, seja humano, seja os de fora, como sendo avatar cacha, ou seja, que trazia uma porção da genética de cada um dos três seres atributos. E eles, Krishna, se apresentou como sendo superior aos três.</w:t>
       </w:r>
+    </w:p>
+    <w:tbl>
+      <w:tblPr>
+        <w:tblW w:type="auto" w:w="0"/>
+        <w:jc w:val="left"/>
+        <w:tblLook w:firstColumn="1" w:firstRow="1" w:lastColumn="0" w:lastRow="0" w:noHBand="0" w:noVBand="1" w:val="04A0"/>
+      </w:tblPr>
+      <w:tblGrid>
+        <w:gridCol w:w="9745"/>
+      </w:tblGrid>
+      <w:tr>
+        <w:tc>
+          <w:tcPr>
+            <w:tcW w:type="dxa" w:w="9745"/>
+            <w:shd w:val="clear" w:fill="EAF3EA"/>
+            <w:tcBorders>
+              <w:left w:val="single" w:sz="24" w:color="2E7D4F"/>
+            </w:tcBorders>
+          </w:tcPr>
+          <w:p>
+            <w:r>
+              <w:rPr>
+                <w:color w:val="2E7D4F"/>
+                <w:sz w:val="19"/>
+              </w:rPr>
+              <w:t>Nota do editor: o Mahabharata (RC-593): a prosa como inovação de Vyasa (vs. poesia métrica); as várias versões para cada família demo (U0799–U0800; U0868–U0871).</w:t>
+            </w:r>
+          </w:p>
+        </w:tc>
+      </w:tr>
+    </w:tbl>
+    <w:p>
+      <w:pPr>
+        <w:spacing w:after="40"/>
+      </w:pPr>
     </w:p>
     <w:p>
       <w:pPr>
@@ -2025,6 +2585,41 @@
         </w:rPr>
         <w:t>Quando Vyasa conta numa rabar, a conversa de Krishna com Arjuna. Arrijuna não queria ir paraa guerra com seus primos. E Krishna basicamente o obriga a ir no sentido de que o motiva filosoficamente disse que ele Krishna garante como provedor de vida que aquilo não iria contrair débito da Juna se ele fosse pra guerra sem ódio. Matasse porque o dharma teria que liquidar o mal pro bem sobreviver. Então Nessa conversa de Crista com Arijúa, que é só um capítulo do Marabarata, mas esse capítulo é um livro à parte chamado Bhagavad Gita, Krishna aqui se apresenta como maior do que os três ser. Só que nessa época, quando eles enviavam avatar cachava [REVISAR — STT], Vishnu não produzia nenhum avatar durante o tempo em que aquele que eles acabaram de engendrar estava funcionando para entrar em choque. Mas aqui tem um detalhe. Eu disse para vocês que há 23.000 anos atrás, quando Shiva começou a se apresentar lá no sul da Índia através de seus avatares, dizendo: "Eu sou o Deus que Brahma ou Javé escolheu Adão e Eva para poder dominar a humanidade através do segmento genético que Enó queria ser o grande avatar de de Brahma ou de Javé. Aí quando Enoque morreu, foi que viro então disse: "Não, não, não, vamos fazer o seguinte, pode deixar que eu vou, Enoque não vai mais aparecer entre os humanos, mas eu vou me fazer humano e vou trazer a humanidade para você." Já foi quando pela terceira vez disse burro, ou seja, disse que ia mergulhar no bolote, produzir um outro avatar, só que na condição humana para trazer a espécie mais importante dessa história que era os humanos para Javé. Foi quando ele fez o plano Jesus, mas ele não tinha mais fio solto, carga para produzir. Então ele pediu a Sophia, que já tinha sido brada para Sophia, que é o DNA de Vishnu que morre só, produziam a Maria foi inseminada pelo pela genética de Sophia Nesse período, ou seja, 23, 22, 20, 21, 18, 17, 16, 15.000 anos, Brahma ficou notando que nada do que ele queria fazer dava certo. Depois do dilúvio, Bram articulou o modo de fazer, não com Enoque, não com humanos, mas Mas com os seres híbridos que foram surgido nos tempos hiperbórios, principalmente depois do dilúvio. Então essa figura que aparece na Vyasa dizendo: "Eu sou branco, vim escutar de ti a tua última invenção. Tu estás aflito porque não sabes se tens a minha concordância para apresentar a todos nós essa versão dos acontecimentos que Crias com esse poema é tão via quando ele oferta o melhor lugar para ele se sentar. Aí ele senta e viaja, faz toda essa explicação que eu acabei de ler. Aí no final esse avatar de Brahma agradece, diz que ele pode fazer e se retira e volta paraos seus aposentos. Isso é mentira? Não. Esse ser é real. Do jeito que Brahma ou Javé fez com Enoque humano, Brahma fez com esse ser que não era humano dentro para que esse demo se achasse um avatar dele. E Brahma era um entrante na cabeça desse ser. Branh, ele dominava o ser e esse ser se deixava dominar porque o egocide dela, ele se achava era um avatar de branco. Essa figura chamada avatar do branco só durou 7000 anos. Ixe, Cristia, olhava para esse tipo de avatar diz: "Eu sou avatar cachado, eu represento o Brahma muito mais que você." Aí esse avatar que se chama Brahma Mestre, então assim, esse Brahma para mestre, o Brahma Méxão, a do Brahma, utilizando seres hídricos de humano, para que eles se achassem encarnação do avatar de branco para poder influenciar o mundo. E não existiam só um não. E esses seres existem até hoje. Quando Javé empacotou as botas, agora que diz: "Eu sou herdeiro". Alguns deles ainda estão atuando, só que não tem poder. ter poder são outras figuras, mas eles estão vivos. Muito provavelmente, creo, um deles estava aqui e você tava vendo porque não é só um e não são do mal, como nós foram vítimas das embromações de Brahma, de Javel. O que Javé fez com Adão, sete, Noé, Abraão, Jacó, Brão, Javé fez também com esse ser. Só que esse ser Eles não são humanos, eles existem e estão tentando entender até hoje o que se passou em especial ultimamente já. Então, Krishna existiu nesse mundo até aproximadamente a época que via teve por aqui. E ele se achava o quê? A posição de supremo desfrutador e criador do universo ou da criação inteira. Cristó se achava isso. A diferões aqui de Krishna com essa figura que se detect eu falo mais tarde, né? Mas Vyasa ele presenciou com confusões entre esse avatar de Brahma turist e outros avatares que tinham na época. E ele olhava para isso tudo e dizia alguma coisa errada. Esses caras são mais poderosos que eu, acho sei o que eles não sabem. Eles vão encantaram por essa não, mas é porque entre judemos, entre esses seres, né, a si mesmo. Esses humanos aí, eles têm mais talentos que, mas eu sou uma parte humana, uma parte desse desse desse tipo de ser. Então assim, Vyasa ele começou a se perguntar, Vyasa sabia dos quase 300 mundos envolvidos com estava se passando na Terra, que ele recebia pedidos. Ah, esclareça pra gente. A gente quem nós somos aqui a loca e ele tinha noção. Por isso que Ele criou essa, mas além disso aqui, ele achava que tinha os supercelos. Mas quando ele começou a criar o próprio critério de lógica dele, crítica, quando ele começou a estudar a astrologia bé que o pai dele tinha escrito. E quando ele abriu a sua memória espiritual das questões relativas a Enoque, e ele viu como foi tratado ainda tinha questão dos anjos todos. Ele começou a perceber que tinha algo de muito errado em toda a história. Ainda assim, ele escreveu a confusão que os netos dele, os pândaras causaram uma guerra dechetro descrita numa barata. Mas entendam, começou a perceber que o que era chamado de sagrado havia problemas. Então, existia sempre na época de Vyasa essa coisa de paraíso de Brahma. Quando as principais interpretações sobre Brahma e Atriburto começaram a acontecer em torno das entrelhinhas dos Vedas, surgiu o nome de Bramarin, o chamado Iraniangarba, o imortal, o que antes desse universo. Então, a diferença entre Brahman o Irania Há e Brahma e o seu avatar Brahma para México, ou seja, são três figuras, tá? Bra, Brh, que é Javé preso lá no grupo. Mas quando nesses últimos 7000 anos ele criou esses avatares que é parecido dizendo: "Ei, eu sou avatar, eu sou ele em pessoa". A diferença entre esses três níveis tinha o seu sentido oculto para muita gente da época, mas não para viagem. Ele começou a perceber que existia esses níveis distintos de consecução de um só eu, de uma só consciência. Começou a perceber o fatiqueamento de consciência desses seres, os avatares. Ele começou a trabalhar com isso, estudava astrologia. que o pai tinha escrito. Mas como é que pode? Para quê? Então esse processo de crítica, de decifração dos porquês por trás disso. E ele perguntava esses seros havia respondido. Ele conhecia tudo que Krishna falou. Deasa conhecia tudo que Krishna falou reproduziu Bagavagita. Foi, foi que reproduziu. Mas ainda assim dizia, tem coisa errada. Ele percebeu assim, a discreta disputa entre Krishna e Paramére não passou despercebido para Vyasa. E entendam, na época de Vyasa, ele era o único ser não teísta. Todo mundo era teísta, ou seja, todo mundo gostava e acreditava naquela divindade que vinha, interferia na sua vida pessoal. Isso é ser teísta, você acreditar num Deus. que é personificado em alguém e esse alguém se mete na vida do devoto. Einstein criou o deus deísta, um deidad que é aquele deus que tipo um reloj cria o relógio, não importa deixa o bicho funcionando. Então um Deus que criou esse universo e deixou ele funcionar, mas não se mete na vida de ninguém. Precisa orar porque ele não vai atender. É o Deus deista. Olhem bem nessa essa época todo mundo era teísta, os hiperbórios também, alguns conseguiam não ser teístas, viás a Deus. Por quê? Porque ele já estava desconfiando que tinha problemas para além do que se podia perceber. Ele percebeu que a grandeza daqueles seres era problemática e que existia um trauma primevo naquela história que endia a noção do ovo cósmico, que na época já era falado. E na cabeça de Vyasa remetia esse trauma primeiro não pro ovo em si, mas para quem havia produzido o ovo, que no caso era esse Brahma. Irmão, com esse tipo de raciocínio, ele disse: "Ei, há problemas de paraíso branque o ovo nas com defeito e o ovo deu origem aos dois universos, bramal e bulok e a Brahma caindo no desses. Esse ovo veio com defeito. Então, quem pôs o ovo tá doente. Quem pôs o ovo é o bramanh e mortal. Cobre absoluto. Vocês estão compreendendo o que eu tô falando? Sim. Essa perspectiva, essa noção, esses 21 tentaram desen tentaram esses 21, quem é dea sucre, o filho dele que era o mesmoalém, filho de e mais figuras alguns, todos esses são inção de que t problemas cármicos internados. Na época se tentou decifrar esses mistérios todos, mas se conversava sobre isso, mas não se escrevia sobre isso porque não tinha como, mas ficou ficou a marcação. Então assim, pessoal, Krishna, ele algumas vezes ou vi porque via ele talvez seja melhor explicar assim A Pantara Tamas foi pai de Parashara, que foi pai de Vyasa. Vyasa foi pai de três filhos. Pandu Dhritarashtra e succa. Esses dois aqui de duas viúvas virgens. Olha a confusão. Olha a confusão. Comprometa as e as duas vistas estão sentadas nessa sala. É o Eu vou vender um óvulo de radar. começar uma nova linhagem. Aí houve uma atividade de interferência para que as duas casassem com dote altíssimo de dois maridos maravilhosos que morreram em batalha, as duas riquíssimas e alguém queria o que queria, que nessa época Vyasa já era um ermita tava na sua fase de porque quando você passa três, cinco 10 anos numa caverna só fazendo yoga.</w:t>
       </w:r>
+    </w:p>
+    <w:tbl>
+      <w:tblPr>
+        <w:tblW w:type="auto" w:w="0"/>
+        <w:jc w:val="left"/>
+        <w:tblLook w:firstColumn="1" w:firstRow="1" w:lastColumn="0" w:lastRow="0" w:noHBand="0" w:noVBand="1" w:val="04A0"/>
+      </w:tblPr>
+      <w:tblGrid>
+        <w:gridCol w:w="9745"/>
+      </w:tblGrid>
+      <w:tr>
+        <w:tc>
+          <w:tcPr>
+            <w:tcW w:type="dxa" w:w="9745"/>
+            <w:shd w:val="clear" w:fill="EAF3EA"/>
+            <w:tcBorders>
+              <w:left w:val="single" w:sz="24" w:color="2E7D4F"/>
+            </w:tcBorders>
+          </w:tcPr>
+          <w:p>
+            <w:r>
+              <w:rPr>
+                <w:color w:val="2E7D4F"/>
+                <w:sz w:val="19"/>
+              </w:rPr>
+              <w:t>Nota do editor: Krishna (RC-414) — STT 'avatar cachava' [REVISAR]: avatar que trazia 'uma porção da genética de cada um dos três seres' da Trimurti; Dwarka e a morte por flechada (U0876–U1097).</w:t>
+            </w:r>
+          </w:p>
+        </w:tc>
+      </w:tr>
+    </w:tbl>
+    <w:p>
+      <w:pPr>
+        <w:spacing w:after="40"/>
+      </w:pPr>
     </w:p>
     <w:p>
       <w:pPr>
@@ -2287,6 +2882,41 @@
         <w:t>Porque na medida em que Vyasa foi [amadurecendo] [REVISAR — STT 'enastecendo'], isso não existe, foi tornando mais elástico o seu pensamento, a sua com ele mesmo, na medida em que ele ele começou Então assim, eh, tudo que um [ser] vinculado ao espírito faz fica marcado no DNA, na assinatura quântica desse espírito que usa sempre o mesmo DNA, não o seu total, mas aquela parte da assinatura quântica em todas as vidas é o mesmo. Não tem como dar. O espiritismo não sabe nada disso e nunca vai, mas é desse jeito. Se o espírito vai encarnar aquela banheira cheia de elétrons que tem as lembranças daquele tipo de assinatura quântica em vidas passadas. Quando o espermatozoide vai chegando perto do tudo em menos de um segundo, lá vem o bicho de novo, ih, ferrou. Tenta se reagrupar os elétrons, tenta se reagrupar as informações. É um negócio maluco. E no final o embriãozinho que nasce tem a assinatura quântica daqueles 28.869 genes. No meio dos ativos tá a assinatura do da mesma consciência espiritual. Eu não estou dizendo que os 28.869 genes do corpo de vocês hoje é igual a das últimas vidas. Tô dizendo que parte desse é porque é assinatura que não Então, Vyasa, ele foi [REVISAR — STT 'Vi'] eh ele ele ele criou na espiritualidade oriental, institutos de busca e de decifração que hoje dão guarida ao nosso, que é no Nepal, no Tibeto.</w:t>
       </w:r>
     </w:p>
+    <w:tbl>
+      <w:tblPr>
+        <w:tblW w:type="auto" w:w="0"/>
+        <w:jc w:val="left"/>
+        <w:tblLook w:firstColumn="1" w:firstRow="1" w:lastColumn="0" w:lastRow="0" w:noHBand="0" w:noVBand="1" w:val="04A0"/>
+      </w:tblPr>
+      <w:tblGrid>
+        <w:gridCol w:w="9745"/>
+      </w:tblGrid>
+      <w:tr>
+        <w:tc>
+          <w:tcPr>
+            <w:tcW w:type="dxa" w:w="9745"/>
+            <w:shd w:val="clear" w:fill="EAF3EA"/>
+            <w:tcBorders>
+              <w:left w:val="single" w:sz="24" w:color="2E7D4F"/>
+            </w:tcBorders>
+          </w:tcPr>
+          <w:p>
+            <w:r>
+              <w:rPr>
+                <w:color w:val="2E7D4F"/>
+                <w:sz w:val="19"/>
+              </w:rPr>
+              <w:t>Nota do editor: QUARENTENA CLÍNICA — '28.869 genes' e 'assinatura quântica do DNA' são leitura do autor, jamais dado validado (U1108–U1110).</w:t>
+            </w:r>
+          </w:p>
+        </w:tc>
+      </w:tr>
+    </w:tbl>
+    <w:p>
+      <w:pPr>
+        <w:spacing w:after="40"/>
+      </w:pPr>
+    </w:p>
     <w:p>
       <w:pPr>
         <w:pStyle w:val="Heading2"/>
@@ -2437,6 +3067,41 @@
         <w:t>Então nós próprios já estamos criando no Biocosmos emergente uma parte dessa nova consciência que na hora em que as assinaturas quânticas vinculadas à busca de algo benéfico encarnam para que haja um ninho de apoio, não é juda, nem é nada de de ah vantagem, é só para diminuir a desvantagem de você tá no mar de lama tentando limpar as coisas e não funciona porque lama é lama. Então alguém tem que trabalhar na a essência da lama para ver se ela vai por uma [via] alquímica [REVISAR — STT] celeste espiritual, se tornando a lama menos [emanada?] [REVISAR — STT 'enameada'], uma podridão menos desagradável. Esse é o jogo. Mas por enquanto somos nós. Nós quem? Esses babacas aqui.</w:t>
       </w:r>
     </w:p>
+    <w:tbl>
+      <w:tblPr>
+        <w:tblW w:type="auto" w:w="0"/>
+        <w:jc w:val="left"/>
+        <w:tblLook w:firstColumn="1" w:firstRow="1" w:lastColumn="0" w:lastRow="0" w:noHBand="0" w:noVBand="1" w:val="04A0"/>
+      </w:tblPr>
+      <w:tblGrid>
+        <w:gridCol w:w="9745"/>
+      </w:tblGrid>
+      <w:tr>
+        <w:tc>
+          <w:tcPr>
+            <w:tcW w:type="dxa" w:w="9745"/>
+            <w:shd w:val="clear" w:fill="EAF3EA"/>
+            <w:tcBorders>
+              <w:left w:val="single" w:sz="24" w:color="2E7D4F"/>
+            </w:tcBorders>
+          </w:tcPr>
+          <w:p>
+            <w:r>
+              <w:rPr>
+                <w:color w:val="2E7D4F"/>
+                <w:sz w:val="19"/>
+              </w:rPr>
+              <w:t>Nota do editor: o Biocosmos emergente e o novo fio (RC-163 — ampliação retida, sem ficha física; RC-612): 'parte biodêmica, parte humana' (U1142; U1185–U1187).</w:t>
+            </w:r>
+          </w:p>
+        </w:tc>
+      </w:tr>
+    </w:tbl>
+    <w:p>
+      <w:pPr>
+        <w:spacing w:after="40"/>
+      </w:pPr>
+    </w:p>
     <w:p>
       <w:pPr>
         <w:pStyle w:val="Heading2"/>
@@ -2737,6 +3402,41 @@
         <w:t>Isso tudo é um material Um, estamos tratando própria da revelação cósmica para ficar mais fácil as gerações do futuro compreenderem esse processo. E é um processo, repito, que não tem autoridade, não tá vinculado a nenhum tipo de [crença?] [REVISAR — STT 'cresce'], despreocupação total em relação a qualquer tipo de crédito. O importante é ter o conceito filosófico vinculado a princípios e propósitos que cada membro pode construir, e um conjunto de critérios em cima do norte para a movimentação dessas instituições no e isso nasceu aqui. Amanhã eu vou falar mais sobre a questão do paraíso e da nova espiritualidade, mas aí eu vou poder fazer um vínculo em outras questões. Então na palestra da manhã a gente vai aprofundar um pouco isso aqui, mas é totalmente independente da palestra de hoje. Mas a de hoje eu considero finalizar Tá, pergunto se questiona isso, se alguém tem alguma pergunta, alguém quer fazerá você ser a série Mar da Netflix e meio propaganda do Musk, mas são duas temporadas muito bem feitas sobre a colonização de Mar porque na verdade o que que é a série da Tatio chato, mas projeto e ela fala do projeto Musk e fala de Mar, então é um pouco falando o que que acontece aqui, que que a turma tá fazendo analogias de petróleo no no Ártico, outras explorações da Inglaterra. O que que acontece em Mar? É muito interessante. Outra série Marte, tem uma série chamada Dexpand na Prime que começa falando de da especiação. Os caras em Marte e um cinturão de asteroides, os caras mais fracos com dedos maiores também. É bem interessante. São quatro temporadas. tem umas ideias boas lá. É, veja só, pessoal, esses assuntos, não isso aqui que a gente tá falando, mas é a especiação da espécie de SES é assunto tratado em tudo que é superâ do poder é fá já tem mais de perto de 90 vacinas. Até a semana passada são 86 vacinas diferentes. Nenhuma delas é uma vacina sacana feita para fazer mal. Todas elas, pelo que eu vejo na espiritualidade, são produto do esforço. Ainda não queira dizer que não seja eficazes, mas é uma tentativa. Está muito em cima. Só que esse vío já tem mais de 4000 séculos. A doença de Ja terrível, é que desenvolvimento da da vacina de RNA que ganhou um impulso muito forte com a pandemia, quanto o dinheiro que foi colocado. Você chegou ali, foi uma médica que apanhou durante anos jogaram ela, ela foi colocada para fora da universidade praticamente porque ela deixia a vacina de RNA, que é a vacina da moderna e da acho que sei. E de repente e essa vacina, pelo que tá se entendendo vai revolucionar a criação de novas vacinas contra vírus, porque ela é muito mais eficaz do que a gente vi eh pagando da da da Coroneva que são ouvidos de macaco, que são as duas que a gente tá usando. no Brasil que essa vacina ela só que é cara ainda, etc, etc, mas ela provou no caminho para você rápidamente conseguir fazer os vacinos de mais vacilo de Deus. Sobre o tema da palestra pessoal perguntas aqui, senão eu perdo a internet. Chegou aqui Enoque. Aí depois de Aa que que você deu as caras com Jacó novamente lá de senhora, porcaria do DNA que José queria criar tribos com Jacó, 12 tribos de Israel. O espírito que me anima tem muita opção. Ele faz, mas eu te perguntar, teve opção ou meio que rapaz, se tem é um grato filho da mãe desgraçado. Esse meu espírito. E ele é, não deixa de ser com a condição humana dele. Sim, porque ele nunca se preocupa com isso. Ele obedece a estratégia que Moros tem para consertar Java conserto. Então tudo que esses filhos vinculado faz, ele não se preocupa com lav, com o ser humano que ele vai produzir, ele se preocupa com as portas da podridão de Jah. Então tenho cinco ou seis espíritos que eu conheço, que eu digo, conheço através do meu espírito, que fazem parte de um grupo de aquelas missões possíveis que nunca deu certo, tão cruz, né? Por isso é ferro atrás de ferro e assim é desde o início. Então faz a tentativa com o Ismael já tava planejado que podia dar problema com o lado de lá ou aquilo ali quando Abraão teve dois filhos e um deles vai para aquilo ali foi planejado também era um plano B ou ele acabou usando o que não deu certo lá de lá o poder de Javé não tem nenhum e os anjos de Javé pensam que tem mas também Não tem, mas ele se arrola como se fosse poderosos, senão não vendo o marketing deles aqui na terra. Nada até hoje funcionou direito, tudo é livro. Eu terminei um livro essa semana, chama-se Nem Deus, nem Javé, nem Darwi. Dois pontos, a evolução do cí, mostrando que isso que acontece na evolução humana é um é um jogo de manipulação de acordo com circunstâncias. Olha aí, redimensiona, dá tudo errado. Aí joga tudo que é dado de novo, é v o resultado, escolhe um, redimensiona. É desse jeito. Só que Javé, ele no meio dessa história toda, ele tem um alinhamento. Desde que ele assassinou Abel, ele deu alinhamento. Ele não quer certas coisas. E ele não quer certas coisas em termos de DNA, ele vai esse famoso big é a expectativa dele. E esse big era o resultado das contas que Mauros fez o que não prestaram. Aí eles associam o que presta a condição humana.</w:t>
       </w:r>
     </w:p>
+    <w:tbl>
+      <w:tblPr>
+        <w:tblW w:type="auto" w:w="0"/>
+        <w:jc w:val="left"/>
+        <w:tblLook w:firstColumn="1" w:firstRow="1" w:lastColumn="0" w:lastRow="0" w:noHBand="0" w:noVBand="1" w:val="04A0"/>
+      </w:tblPr>
+      <w:tblGrid>
+        <w:gridCol w:w="9745"/>
+      </w:tblGrid>
+      <w:tr>
+        <w:tc>
+          <w:tcPr>
+            <w:tcW w:type="dxa" w:w="9745"/>
+            <w:shd w:val="clear" w:fill="EAF3EA"/>
+            <w:tcBorders>
+              <w:left w:val="single" w:sz="24" w:color="2E7D4F"/>
+            </w:tcBorders>
+          </w:tcPr>
+          <w:p>
+            <w:r>
+              <w:rPr>
+                <w:color w:val="2E7D4F"/>
+                <w:sz w:val="19"/>
+              </w:rPr>
+              <w:t>Nota do editor: obra cadastrada como B082 — 'Nem Deus, nem Javé, nem Darwin: a evolução do cérebro' (U1259–U1260); sinopse reconstruída da fala, aguardando confirmação bibliográfica.</w:t>
+            </w:r>
+          </w:p>
+        </w:tc>
+      </w:tr>
+    </w:tbl>
+    <w:p>
+      <w:pPr>
+        <w:spacing w:after="40"/>
+      </w:pPr>
+    </w:p>
     <w:p>
       <w:pPr>
         <w:pStyle w:val="Heading2"/>
@@ -2861,6 +3561,41 @@
         <w:t>Eh, a astrologia ocidental ou mesmo védica, tem sua razão de existir. Esse conhecimento antigo tem sua função realmente para auxiliar em algo os seres humanos hoje no presente aqui na Terra?</w:t>
       </w:r>
     </w:p>
+    <w:tbl>
+      <w:tblPr>
+        <w:tblW w:type="auto" w:w="0"/>
+        <w:jc w:val="left"/>
+        <w:tblLook w:firstColumn="1" w:firstRow="1" w:lastColumn="0" w:lastRow="0" w:noHBand="0" w:noVBand="1" w:val="04A0"/>
+      </w:tblPr>
+      <w:tblGrid>
+        <w:gridCol w:w="9745"/>
+      </w:tblGrid>
+      <w:tr>
+        <w:tc>
+          <w:tcPr>
+            <w:tcW w:type="dxa" w:w="9745"/>
+            <w:shd w:val="clear" w:fill="EAF3EA"/>
+            <w:tcBorders>
+              <w:left w:val="single" w:sz="24" w:color="2E7D4F"/>
+            </w:tcBorders>
+          </w:tcPr>
+          <w:p>
+            <w:r>
+              <w:rPr>
+                <w:color w:val="2E7D4F"/>
+                <w:sz w:val="19"/>
+              </w:rPr>
+              <w:t>Nota do editor: Pergunta 1 da plateia — resposta sobre a astrologia védica (função prática hoje; liberdade do ser humano); fala da plateia não compõe a ontologia (U1300–U1310).</w:t>
+            </w:r>
+          </w:p>
+        </w:tc>
+      </w:tr>
+    </w:tbl>
+    <w:p>
+      <w:pPr>
+        <w:spacing w:after="40"/>
+      </w:pPr>
+    </w:p>
     <w:p>
       <w:pPr>
         <w:spacing w:after="80"/>
@@ -2926,6 +3661,41 @@
         <w:t>Próxima pergunta é uma pergunta um pouco mais técnica. Qual é a Só só, só só só um detalhe. Quem mais ferrou com astrologia foi Zeus e Apolo, quando eles criaram oráculos porque como os portais estavam fechando, eles iam perder o contato direto com os seres humanos. E eles perceberam que os humanos iam da terra E eles continuaram a criar uma forma de controlar os humanos. Então, criaram os oráculos para viciar os humanos, a sempre estarem perguntando aos oráculos para que mesmo lá por trás do portal fechado, os deuses continuaram a dizer aos humanos o que é que eles podem ou não podem fazer. Isso aqui também ferrou no dia que hoje a gente conhece, porque tá todo mundo viciado em querer saber as coisas e nem tudo é conveniente a gente saber e nem todo tipo de pergunta que a gente quer saber sobre o futuro da gente tem alguma lógica, tem alguma coisa em termos de qualidade pra gente. Mas esse nosso vício, né? No dia que eu fiz uma palestra chamada Os mistérios dos livros oraculares, [Lúcifer?] e Tarô [REVISAR — STT 'Lucas'], eu vou falar mais profundamente sobre isso, mas esse nosso vício meio que ferrou. A astrologia védica era para ser tratada com os iniciados [REVISAR — STT 'indiciados'], não era com popula acho, nem deno, nem humano, era para resolver assuntos de altíssimo nível entre que os seres compreendessem o processo. Mas aí essa questão de o que a gente chama hoje de horóscopo de não sei o quê, aí já é um um leitura que a gente tem que tomar muito cuidado porque são questões vários. Qual a conexão entre Jyotisha e as [águas?] [REVISAR — STT 'ágas']? Já que eu ouvi a frase Jyotisha seria Matemática vética e [águia?] seria engenharia [REVISAR — STT] vética. Isso, isso faz algum sentido?</w:t>
       </w:r>
     </w:p>
+    <w:tbl>
+      <w:tblPr>
+        <w:tblW w:type="auto" w:w="0"/>
+        <w:jc w:val="left"/>
+        <w:tblLook w:firstColumn="1" w:firstRow="1" w:lastColumn="0" w:lastRow="0" w:noHBand="0" w:noVBand="1" w:val="04A0"/>
+      </w:tblPr>
+      <w:tblGrid>
+        <w:gridCol w:w="9745"/>
+      </w:tblGrid>
+      <w:tr>
+        <w:tc>
+          <w:tcPr>
+            <w:tcW w:type="dxa" w:w="9745"/>
+            <w:shd w:val="clear" w:fill="EAF3EA"/>
+            <w:tcBorders>
+              <w:left w:val="single" w:sz="24" w:color="2E7D4F"/>
+            </w:tcBorders>
+          </w:tcPr>
+          <w:p>
+            <w:r>
+              <w:rPr>
+                <w:color w:val="2E7D4F"/>
+                <w:sz w:val="19"/>
+              </w:rPr>
+              <w:t>Nota do editor: Pergunta 2 da plateia — Jyotisha/Vedanga (STT 'Giotista'); o aparte de Ellam sobre Zeus e Apolo e os oráculos está registrado (U1311–U1324).</w:t>
+            </w:r>
+          </w:p>
+        </w:tc>
+      </w:tr>
+    </w:tbl>
+    <w:p>
+      <w:pPr>
+        <w:spacing w:after="40"/>
+      </w:pPr>
+    </w:p>
     <w:p>
       <w:pPr>
         <w:spacing w:after="80"/>
@@ -2991,6 +3761,41 @@
         <w:t>Última pergunta, Rogério. Eh, o espírito de Marcos em Rochester [REVISAR — STT 'Voches'] teriam relação com o espírito das moiras? Pergunto das moiras. Pergunto, pois parece que o espírito de Moros e dessas duas figuras vem encarnando junto. As moiras estariam encarnadas?</w:t>
       </w:r>
     </w:p>
+    <w:tbl>
+      <w:tblPr>
+        <w:tblW w:type="auto" w:w="0"/>
+        <w:jc w:val="left"/>
+        <w:tblLook w:firstColumn="1" w:firstRow="1" w:lastColumn="0" w:lastRow="0" w:noHBand="0" w:noVBand="1" w:val="04A0"/>
+      </w:tblPr>
+      <w:tblGrid>
+        <w:gridCol w:w="9745"/>
+      </w:tblGrid>
+      <w:tr>
+        <w:tc>
+          <w:tcPr>
+            <w:tcW w:type="dxa" w:w="9745"/>
+            <w:shd w:val="clear" w:fill="EAF3EA"/>
+            <w:tcBorders>
+              <w:left w:val="single" w:sz="24" w:color="2E7D4F"/>
+            </w:tcBorders>
+          </w:tcPr>
+          <w:p>
+            <w:r>
+              <w:rPr>
+                <w:color w:val="2E7D4F"/>
+                <w:sz w:val="19"/>
+              </w:rPr>
+              <w:t>Nota do editor: Pergunta 3 da plateia — espírito de Marcos/Rochester × moiras; resposta inclui Frigga/Aran e as três setas de Moros (U1348–U1372).</w:t>
+            </w:r>
+          </w:p>
+        </w:tc>
+      </w:tr>
+    </w:tbl>
+    <w:p>
+      <w:pPr>
+        <w:spacing w:after="40"/>
+      </w:pPr>
+    </w:p>
     <w:p>
       <w:pPr>
         <w:spacing w:after="80"/>
@@ -3042,6 +3847,41 @@
         </w:rPr>
         <w:t>Começar a partir de quê? De que é a a um [substancial?] termo de informação [REVISAR — STT]. Ah, mas daqui a 10.000 anos, daqui a 10.000 anos tem o IEA e mais uns 500 institutos e outras 500 pessoas criaram como desdobramento e certo ou errado a coisa vai. Mas o IEA vai continuar existindo na sua centralidade de nesse marco temporal. ano 2020, no século XXI, tem iniciado a revelação cósmica, mas a revelação cósmica é coisa para milhões de anos, é um processo que os fatos é que vão falar por si mesmos, deverão apenas ser interpretados corretamente. Até hoje a gente usa da revelação, ou seja, encarna homens e mulheres e fala de fatos que ninguém viu. Daqui pra frente serão os fatos acontecendo e todo mundo olhando e tá dando. Então a revelação do homem é isso. Isso ainda que vai ter jeito, vai dizer isso não aconteceu, tá na frente dele. Aí ele cria uma narrativa pós verdade, maluca. Não, que seja isso não é revelação. É outra história, Trump Bolsonaro e outros que Mas assim eh eh eh você vai analisando as coisas. Isso é revelação cósmica. Quando chegar no padrão correto de de de um ser humano poder usar de perspectivismo e analisar algo que ele tá analisando, mas vendo de diversos ângulos. Nós estamos acostumados aqui a olhar e já tem uma opinião e aquela opinião já é verdade e pronto. Isso é infantilismo intelectual, espiritual e psíquico. A gente precisa observar coisa com maturidade. Depois de olhar sobre o perspectivismo, aí vai ter que ter uma opinião. Mas isso não quer dizer que você tá certo, não. Aquilo é só a melhor, o melhor arranjo do você elaborou para lidar ou com aquela pessoa, ou com aquela situação, ou para descrever um evento, ou para entender o problema ou para conceituar algo. A revelação cósmica, acima de tudo, é a primeira revelação que nunca vai ser pretendida como verdadeira. Ela tem que ser honesta, não necessariamente verdadeira na sua conclusão final, mas sempre honesta no sentido de buscar a verdade e por isso nunca vai [se corromper] [REVISAR — STT 'carbar']. Daqui a verdade, daqui ninguém passa. Isso aqui é repetir os erros dos três primeiros. dois ó, quarto não tem nada a ver com isso não. Então se alguém tiver muita certeza trabalhando no IEA, é bom tomar umas [vitaminas?] [REVISAR — STT 'felic']. Quanto menos certeza a gente tiver, melhor e mais suave e agradável será possível. Nós podemos ter muita coleção de arquivos para consulta, muitos verbetes, muita análise, muito estudo e possibilidade. Mas bater isso aqui é verdade, ninguém não tão cedo. Bem, agradeço então a vocês. Amanhã a gente continua às 10. Obrigado.</w:t>
       </w:r>
+    </w:p>
+    <w:tbl>
+      <w:tblPr>
+        <w:tblW w:type="auto" w:w="0"/>
+        <w:jc w:val="left"/>
+        <w:tblLook w:firstColumn="1" w:firstRow="1" w:lastColumn="0" w:lastRow="0" w:noHBand="0" w:noVBand="1" w:val="04A0"/>
+      </w:tblPr>
+      <w:tblGrid>
+        <w:gridCol w:w="9745"/>
+      </w:tblGrid>
+      <w:tr>
+        <w:tc>
+          <w:tcPr>
+            <w:tcW w:type="dxa" w:w="9745"/>
+            <w:shd w:val="clear" w:fill="EAF3EA"/>
+            <w:tcBorders>
+              <w:left w:val="single" w:sz="24" w:color="2E7D4F"/>
+            </w:tcBorders>
+          </w:tcPr>
+          <w:p>
+            <w:r>
+              <w:rPr>
+                <w:color w:val="2E7D4F"/>
+                <w:sz w:val="19"/>
+              </w:rPr>
+              <w:t>Nota do editor: encerramento — 'amanhã a gente continua às 10'; falas da plateia isoladas na PARTE XII não compõem a ontologia (U1402–U1404).</w:t>
+            </w:r>
+          </w:p>
+        </w:tc>
+      </w:tr>
+    </w:tbl>
+    <w:p>
+      <w:pPr>
+        <w:spacing w:after="40"/>
+      </w:pPr>
     </w:p>
     <w:p>
       <w:r>

</xml_diff>